<commit_message>
Update team member roles and responsibilities
</commit_message>
<xml_diff>
--- a/ICT942_Tutorial_1_Week1_Workshop_HealthcareIntegration.docx
+++ b/ICT942_Tutorial_1_Week1_Workshop_HealthcareIntegration.docx
@@ -426,7 +426,23 @@
                 <w:sz w:val="20"/>
                 <w:szCs w:val="20"/>
               </w:rPr>
-              <w:t>This workshop builds the Week 1 section of your Assessment 1 portfolio. Wherever you see a blue [ ... ] prompt, replace it with your own text, figure or link — keep the surrounding structure.</w:t>
+              <w:t xml:space="preserve">This workshop builds the Week 1 section of your Assessment 1 portfolio. Wherever you see a blue [ </w:t>
+            </w:r>
+            <w:proofErr w:type="gramStart"/>
+            <w:r>
+              <w:rPr>
+                <w:sz w:val="20"/>
+                <w:szCs w:val="20"/>
+              </w:rPr>
+              <w:t>... ]</w:t>
+            </w:r>
+            <w:proofErr w:type="gramEnd"/>
+            <w:r>
+              <w:rPr>
+                <w:sz w:val="20"/>
+                <w:szCs w:val="20"/>
+              </w:rPr>
+              <w:t xml:space="preserve"> prompt, replace it with your own text, figure or link — keep the surrounding structure.</w:t>
             </w:r>
           </w:p>
           <w:p>
@@ -475,7 +491,29 @@
           <w:szCs w:val="30"/>
         </w:rPr>
         <w:lastRenderedPageBreak/>
-        <w:t>Assessment 1 at a glance — the five-week journey</w:t>
+        <w:t xml:space="preserve">Assessment 1 </w:t>
+      </w:r>
+      <w:proofErr w:type="gramStart"/>
+      <w:r>
+        <w:rPr>
+          <w:b/>
+          <w:bCs/>
+          <w:color w:val="1F3864"/>
+          <w:sz w:val="30"/>
+          <w:szCs w:val="30"/>
+        </w:rPr>
+        <w:t>at a glance</w:t>
+      </w:r>
+      <w:proofErr w:type="gramEnd"/>
+      <w:r>
+        <w:rPr>
+          <w:b/>
+          <w:bCs/>
+          <w:color w:val="1F3864"/>
+          <w:sz w:val="30"/>
+          <w:szCs w:val="30"/>
+        </w:rPr>
+        <w:t xml:space="preserve"> — the five-week journey</w:t>
       </w:r>
     </w:p>
     <w:p>
@@ -732,12 +770,21 @@
             <w:pPr>
               <w:spacing w:before="40" w:after="40"/>
             </w:pPr>
-            <w:r>
-              <w:rPr>
-                <w:sz w:val="20"/>
-                <w:szCs w:val="20"/>
-              </w:rPr>
-              <w:t>Organisation, root cause, SWOT — Rubric 1</w:t>
+            <w:proofErr w:type="spellStart"/>
+            <w:r>
+              <w:rPr>
+                <w:sz w:val="20"/>
+                <w:szCs w:val="20"/>
+              </w:rPr>
+              <w:t>Organisation</w:t>
+            </w:r>
+            <w:proofErr w:type="spellEnd"/>
+            <w:r>
+              <w:rPr>
+                <w:sz w:val="20"/>
+                <w:szCs w:val="20"/>
+              </w:rPr>
+              <w:t>, root cause, SWOT — Rubric 1</w:t>
             </w:r>
           </w:p>
         </w:tc>
@@ -811,7 +858,23 @@
                 <w:sz w:val="20"/>
                 <w:szCs w:val="20"/>
               </w:rPr>
-              <w:t>Stakeholder / functional / non-functional reqs — Rubric 2</w:t>
+              <w:t xml:space="preserve">Stakeholder / functional / non-functional </w:t>
+            </w:r>
+            <w:proofErr w:type="spellStart"/>
+            <w:r>
+              <w:rPr>
+                <w:sz w:val="20"/>
+                <w:szCs w:val="20"/>
+              </w:rPr>
+              <w:t>reqs</w:t>
+            </w:r>
+            <w:proofErr w:type="spellEnd"/>
+            <w:r>
+              <w:rPr>
+                <w:sz w:val="20"/>
+                <w:szCs w:val="20"/>
+              </w:rPr>
+              <w:t xml:space="preserve"> — Rubric 2</w:t>
             </w:r>
           </w:p>
         </w:tc>
@@ -991,7 +1054,15 @@
         <w:spacing w:after="60" w:line="264" w:lineRule="auto"/>
       </w:pPr>
       <w:r>
-        <w:t>Interpret the industry project brief and define the cybersecurity problem in context.</w:t>
+        <w:t xml:space="preserve">Interpret the industry project </w:t>
+      </w:r>
+      <w:proofErr w:type="gramStart"/>
+      <w:r>
+        <w:t>brief</w:t>
+      </w:r>
+      <w:proofErr w:type="gramEnd"/>
+      <w:r>
+        <w:t xml:space="preserve"> and define the cybersecurity problem in context.</w:t>
       </w:r>
     </w:p>
     <w:p>
@@ -1017,7 +1088,15 @@
         <w:spacing w:after="60" w:line="264" w:lineRule="auto"/>
       </w:pPr>
       <w:r>
-        <w:t>Identify and prioritise stakeholders using interest and influence.</w:t>
+        <w:t xml:space="preserve">Identify and </w:t>
+      </w:r>
+      <w:proofErr w:type="spellStart"/>
+      <w:r>
+        <w:t>prioritise</w:t>
+      </w:r>
+      <w:proofErr w:type="spellEnd"/>
+      <w:r>
+        <w:t xml:space="preserve"> stakeholders using interest and influence.</w:t>
       </w:r>
     </w:p>
     <w:p>
@@ -1436,12 +1515,21 @@
             <w:pPr>
               <w:spacing w:before="40" w:after="40"/>
             </w:pPr>
-            <w:r>
-              <w:rPr>
-                <w:sz w:val="20"/>
-                <w:szCs w:val="20"/>
-              </w:rPr>
-              <w:t>Stakeholder register and matrix</w:t>
+            <w:proofErr w:type="gramStart"/>
+            <w:r>
+              <w:rPr>
+                <w:sz w:val="20"/>
+                <w:szCs w:val="20"/>
+              </w:rPr>
+              <w:t>Stakeholder</w:t>
+            </w:r>
+            <w:proofErr w:type="gramEnd"/>
+            <w:r>
+              <w:rPr>
+                <w:sz w:val="20"/>
+                <w:szCs w:val="20"/>
+              </w:rPr>
+              <w:t xml:space="preserve"> register and matrix</w:t>
             </w:r>
           </w:p>
         </w:tc>
@@ -1620,7 +1708,15 @@
         <w:spacing w:after="120" w:line="276" w:lineRule="auto"/>
       </w:pPr>
       <w:r>
-        <w:t>Explain the difference between a business symptom, a cybersecurity problem and a proposed solution. Students should not jump directly from “the organisation has phishing incidents” to “build an AI platform”.</w:t>
+        <w:t xml:space="preserve">Explain the difference between a business symptom, a cybersecurity problem and a proposed solution. Students should not jump directly from “the </w:t>
+      </w:r>
+      <w:proofErr w:type="spellStart"/>
+      <w:r>
+        <w:t>organisation</w:t>
+      </w:r>
+      <w:proofErr w:type="spellEnd"/>
+      <w:r>
+        <w:t xml:space="preserve"> has phishing incidents” to “build an AI platform”.</w:t>
       </w:r>
     </w:p>
     <w:tbl>
@@ -1718,8 +1814,20 @@
           <w:sz w:val="22"/>
           <w:szCs w:val="22"/>
         </w:rPr>
-        <w:t>Your notes from the mini-lesson</w:t>
-      </w:r>
+        <w:t xml:space="preserve">Your notes from the </w:t>
+      </w:r>
+      <w:proofErr w:type="gramStart"/>
+      <w:r>
+        <w:rPr>
+          <w:b/>
+          <w:bCs/>
+          <w:color w:val="595959"/>
+          <w:sz w:val="22"/>
+          <w:szCs w:val="22"/>
+        </w:rPr>
+        <w:t>mini-lesson</w:t>
+      </w:r>
+      <w:proofErr w:type="gramEnd"/>
     </w:p>
     <w:p>
       <w:pPr>
@@ -1737,7 +1845,73 @@
           <w:sz w:val="20"/>
           <w:szCs w:val="20"/>
         </w:rPr>
-        <w:t xml:space="preserve">  Key takeaways from the Week 1 mini-lesson: a project charter is a short (1–3 page), stable document that authorises a project and states why and what — never how it will be built (PMBOK® 7). It has six sections: overview, background, objectives, scope, stakeholder analysis and success criteria, matching our report template exactly. Objectives must be SMART — e.g. "improve security and make staff more aware" is weak, while a strong objective names one outcome, a measurable target, a realistic 12-week scope and a deadline. Scope needs an explicit out-of-scope list, since scope creep (uncontrolled, unapproved expansion) is described as the number-one killer of student and industry projects alike; any change should be logged in Jira and approved before work starts. Stakeholder analysis uses a register (role, interest, influence, engagement approach) plus Mendelow's power–interest grid to decide how to engage each quadrant — manage closely, keep satisfied, keep informed, or monitor. Success criteria are distinct from objectives: objectives state what we will achieve, success criteria state how everyone will agree we achieved it, and should be observable/verifiable at project close — including a criterion for professional practice evidenced through weekly GitHub commits and Jira activity from every member. The worked example (SecureCare Health, a phishing-resilience project) showed this structure end-to-end and is the model we followed when drafting our own Healthcare Integration &amp; Clinical Terminology Test Harness charter below.</w:t>
+        <w:t xml:space="preserve">  Key takeaways from the Week 1 mini-lesson: a project charter is a short (1–3 page), stable document that </w:t>
+      </w:r>
+      <w:proofErr w:type="spellStart"/>
+      <w:r>
+        <w:rPr>
+          <w:i/>
+          <w:iCs/>
+          <w:color w:val="0563C1"/>
+          <w:sz w:val="20"/>
+          <w:szCs w:val="20"/>
+        </w:rPr>
+        <w:t>authorises</w:t>
+      </w:r>
+      <w:proofErr w:type="spellEnd"/>
+      <w:r>
+        <w:rPr>
+          <w:i/>
+          <w:iCs/>
+          <w:color w:val="0563C1"/>
+          <w:sz w:val="20"/>
+          <w:szCs w:val="20"/>
+        </w:rPr>
+        <w:t xml:space="preserve"> a project and states why and what — never how it will be built (PMBOK® 7). It has six sections: overview, background, objectives, scope, stakeholder analysis and success criteria, matching our report template exactly. Objectives must be SMART — e.g. "improve security and make staff more aware" is weak, while a strong objective names one outcome, a measurable target, a realistic 12-week scope and a deadline. Scope needs an explicit out-of-scope list, since scope creep (uncontrolled, unapproved expansion) is described as the </w:t>
+      </w:r>
+      <w:proofErr w:type="gramStart"/>
+      <w:r>
+        <w:rPr>
+          <w:i/>
+          <w:iCs/>
+          <w:color w:val="0563C1"/>
+          <w:sz w:val="20"/>
+          <w:szCs w:val="20"/>
+        </w:rPr>
+        <w:t>number-one</w:t>
+      </w:r>
+      <w:proofErr w:type="gramEnd"/>
+      <w:r>
+        <w:rPr>
+          <w:i/>
+          <w:iCs/>
+          <w:color w:val="0563C1"/>
+          <w:sz w:val="20"/>
+          <w:szCs w:val="20"/>
+        </w:rPr>
+        <w:t xml:space="preserve"> killer of student and industry projects alike; any change should be logged in Jira and approved before work starts. Stakeholder analysis uses a register (role, interest, influence, engagement approach) plus Mendelow's power–interest grid to decide how to engage each quadrant — manage closely, keep satisfied, keep informed, or monitor. Success criteria are distinct from objectives: objectives state what we will achieve, success criteria state how everyone will agree we achieved it, and should be observable/verifiable at project close — including a criterion for professional practice evidenced through weekly GitHub commits and Jira activity from every member. The worked example (</w:t>
+      </w:r>
+      <w:proofErr w:type="spellStart"/>
+      <w:r>
+        <w:rPr>
+          <w:i/>
+          <w:iCs/>
+          <w:color w:val="0563C1"/>
+          <w:sz w:val="20"/>
+          <w:szCs w:val="20"/>
+        </w:rPr>
+        <w:t>SecureCare</w:t>
+      </w:r>
+      <w:proofErr w:type="spellEnd"/>
+      <w:r>
+        <w:rPr>
+          <w:i/>
+          <w:iCs/>
+          <w:color w:val="0563C1"/>
+          <w:sz w:val="20"/>
+          <w:szCs w:val="20"/>
+        </w:rPr>
+        <w:t xml:space="preserve"> Health, a phishing-resilience project) showed this structure end-to-end and is the model we followed when drafting our own Healthcare Integration &amp; Clinical Terminology Test Harness charter below.</w:t>
       </w:r>
     </w:p>
     <w:p>
@@ -2122,52 +2296,9 @@
                 <w:sz w:val="19"/>
                 <w:szCs w:val="19"/>
               </w:rPr>
-              <w:t>ICT942_[DeliverableName]_[Version]_[DDMMYY], e.g. ICT942_ProjectCharter_v1_270726</w:t>
-            </w:r>
-          </w:p>
-        </w:tc>
-      </w:tr>
-      <w:tr>
-        <w:tc>
-          <w:tcPr>
-            <w:tcW w:w="3000" w:type="dxa"/>
-            <w:shd w:val="clear" w:color="auto" w:fill="F2F5FB"/>
-            <w:tcMar>
-              <w:top w:w="60" w:type="dxa"/>
-              <w:left w:w="90" w:type="dxa"/>
-              <w:bottom w:w="60" w:type="dxa"/>
-              <w:right w:w="90" w:type="dxa"/>
-            </w:tcMar>
-          </w:tcPr>
-          <w:p>
-            <w:pPr>
-              <w:spacing w:before="40" w:after="40"/>
-            </w:pPr>
-            <w:r>
-              <w:rPr>
-                <w:b/>
-                <w:bCs/>
-                <w:sz w:val="20"/>
-                <w:szCs w:val="20"/>
-              </w:rPr>
-              <w:t>Jira update rules (when tasks are moved)</w:t>
-            </w:r>
-          </w:p>
-        </w:tc>
-        <w:tc>
-          <w:tcPr>
-            <w:tcW w:w="6360" w:type="dxa"/>
-            <w:tcMar>
-              <w:top w:w="60" w:type="dxa"/>
-              <w:left w:w="90" w:type="dxa"/>
-              <w:bottom w:w="60" w:type="dxa"/>
-              <w:right w:w="90" w:type="dxa"/>
-            </w:tcMar>
-          </w:tcPr>
-          <w:p>
-            <w:pPr>
-              <w:spacing w:before="40" w:after="40"/>
-            </w:pPr>
+              <w:t>ICT942_[</w:t>
+            </w:r>
+            <w:proofErr w:type="spellStart"/>
             <w:r>
               <w:rPr>
                 <w:i/>
@@ -2176,52 +2307,9 @@
                 <w:sz w:val="19"/>
                 <w:szCs w:val="19"/>
               </w:rPr>
-              <w:t>Tasks moved to “In Progress” when started and “Done” within 24 hours of completion, with a comment describing the work done</w:t>
-            </w:r>
-          </w:p>
-        </w:tc>
-      </w:tr>
-      <w:tr>
-        <w:tc>
-          <w:tcPr>
-            <w:tcW w:w="3000" w:type="dxa"/>
-            <w:shd w:val="clear" w:color="auto" w:fill="F2F5FB"/>
-            <w:tcMar>
-              <w:top w:w="60" w:type="dxa"/>
-              <w:left w:w="90" w:type="dxa"/>
-              <w:bottom w:w="60" w:type="dxa"/>
-              <w:right w:w="90" w:type="dxa"/>
-            </w:tcMar>
-          </w:tcPr>
-          <w:p>
-            <w:pPr>
-              <w:spacing w:before="40" w:after="40"/>
-            </w:pPr>
-            <w:r>
-              <w:rPr>
-                <w:b/>
-                <w:bCs/>
-                <w:sz w:val="20"/>
-                <w:szCs w:val="20"/>
-              </w:rPr>
-              <w:t>GitHub commit expectations</w:t>
-            </w:r>
-          </w:p>
-        </w:tc>
-        <w:tc>
-          <w:tcPr>
-            <w:tcW w:w="6360" w:type="dxa"/>
-            <w:tcMar>
-              <w:top w:w="60" w:type="dxa"/>
-              <w:left w:w="90" w:type="dxa"/>
-              <w:bottom w:w="60" w:type="dxa"/>
-              <w:right w:w="90" w:type="dxa"/>
-            </w:tcMar>
-          </w:tcPr>
-          <w:p>
-            <w:pPr>
-              <w:spacing w:before="40" w:after="40"/>
-            </w:pPr>
+              <w:t>DeliverableName</w:t>
+            </w:r>
+            <w:proofErr w:type="spellEnd"/>
             <w:r>
               <w:rPr>
                 <w:i/>
@@ -2230,7 +2318,7 @@
                 <w:sz w:val="19"/>
                 <w:szCs w:val="19"/>
               </w:rPr>
-              <w:t>At least two commits per week per member, with clear descriptive messages; no direct commits to the main branch without review</w:t>
+              <w:t>]_[Version]_[DDMMYY], e.g. ICT942_ProjectCharter_v1_270726</w:t>
             </w:r>
           </w:p>
         </w:tc>
@@ -2258,6 +2346,115 @@
                 <w:sz w:val="20"/>
                 <w:szCs w:val="20"/>
               </w:rPr>
+              <w:t>Jira update rules (when tasks are moved)</w:t>
+            </w:r>
+          </w:p>
+        </w:tc>
+        <w:tc>
+          <w:tcPr>
+            <w:tcW w:w="6360" w:type="dxa"/>
+            <w:tcMar>
+              <w:top w:w="60" w:type="dxa"/>
+              <w:left w:w="90" w:type="dxa"/>
+              <w:bottom w:w="60" w:type="dxa"/>
+              <w:right w:w="90" w:type="dxa"/>
+            </w:tcMar>
+          </w:tcPr>
+          <w:p>
+            <w:pPr>
+              <w:spacing w:before="40" w:after="40"/>
+            </w:pPr>
+            <w:r>
+              <w:rPr>
+                <w:i/>
+                <w:iCs/>
+                <w:color w:val="0563C1"/>
+                <w:sz w:val="19"/>
+                <w:szCs w:val="19"/>
+              </w:rPr>
+              <w:t>Tasks moved to “In Progress” when started and “Done” within 24 hours of completion, with a comment describing the work done</w:t>
+            </w:r>
+          </w:p>
+        </w:tc>
+      </w:tr>
+      <w:tr>
+        <w:tc>
+          <w:tcPr>
+            <w:tcW w:w="3000" w:type="dxa"/>
+            <w:shd w:val="clear" w:color="auto" w:fill="F2F5FB"/>
+            <w:tcMar>
+              <w:top w:w="60" w:type="dxa"/>
+              <w:left w:w="90" w:type="dxa"/>
+              <w:bottom w:w="60" w:type="dxa"/>
+              <w:right w:w="90" w:type="dxa"/>
+            </w:tcMar>
+          </w:tcPr>
+          <w:p>
+            <w:pPr>
+              <w:spacing w:before="40" w:after="40"/>
+            </w:pPr>
+            <w:r>
+              <w:rPr>
+                <w:b/>
+                <w:bCs/>
+                <w:sz w:val="20"/>
+                <w:szCs w:val="20"/>
+              </w:rPr>
+              <w:t>GitHub commit expectations</w:t>
+            </w:r>
+          </w:p>
+        </w:tc>
+        <w:tc>
+          <w:tcPr>
+            <w:tcW w:w="6360" w:type="dxa"/>
+            <w:tcMar>
+              <w:top w:w="60" w:type="dxa"/>
+              <w:left w:w="90" w:type="dxa"/>
+              <w:bottom w:w="60" w:type="dxa"/>
+              <w:right w:w="90" w:type="dxa"/>
+            </w:tcMar>
+          </w:tcPr>
+          <w:p>
+            <w:pPr>
+              <w:spacing w:before="40" w:after="40"/>
+            </w:pPr>
+            <w:r>
+              <w:rPr>
+                <w:i/>
+                <w:iCs/>
+                <w:color w:val="0563C1"/>
+                <w:sz w:val="19"/>
+                <w:szCs w:val="19"/>
+              </w:rPr>
+              <w:t>At least two commits per week per member, with clear descriptive messages; no direct commits to the main branch without review</w:t>
+            </w:r>
+          </w:p>
+        </w:tc>
+      </w:tr>
+      <w:tr>
+        <w:tc>
+          <w:tcPr>
+            <w:tcW w:w="3000" w:type="dxa"/>
+            <w:shd w:val="clear" w:color="auto" w:fill="F2F5FB"/>
+            <w:tcMar>
+              <w:top w:w="60" w:type="dxa"/>
+              <w:left w:w="90" w:type="dxa"/>
+              <w:bottom w:w="60" w:type="dxa"/>
+              <w:right w:w="90" w:type="dxa"/>
+            </w:tcMar>
+          </w:tcPr>
+          <w:p>
+            <w:pPr>
+              <w:spacing w:before="40" w:after="40"/>
+            </w:pPr>
+            <w:r>
+              <w:rPr>
+                <w:b/>
+                <w:bCs/>
+                <w:sz w:val="20"/>
+                <w:szCs w:val="20"/>
+              </w:rPr>
+              <w:lastRenderedPageBreak/>
               <w:t>Conflict escalation path</w:t>
             </w:r>
           </w:p>
@@ -2519,24 +2716,9 @@
                 <w:sz w:val="19"/>
                 <w:szCs w:val="19"/>
               </w:rPr>
-              <w:t>Charity Gwese</w:t>
-            </w:r>
-          </w:p>
-        </w:tc>
-        <w:tc>
-          <w:tcPr>
-            <w:tcW w:w="3120" w:type="dxa"/>
-            <w:tcMar>
-              <w:top w:w="60" w:type="dxa"/>
-              <w:left w:w="90" w:type="dxa"/>
-              <w:bottom w:w="60" w:type="dxa"/>
-              <w:right w:w="90" w:type="dxa"/>
-            </w:tcMar>
-          </w:tcPr>
-          <w:p>
-            <w:pPr>
-              <w:spacing w:before="40" w:after="40"/>
-            </w:pPr>
+              <w:t xml:space="preserve">Charity </w:t>
+            </w:r>
+            <w:proofErr w:type="spellStart"/>
             <w:r>
               <w:rPr>
                 <w:i/>
@@ -2545,8 +2727,9 @@
                 <w:sz w:val="19"/>
                 <w:szCs w:val="19"/>
               </w:rPr>
-              <w:t>Clinical Data Specialist</w:t>
-            </w:r>
+              <w:t>Gwese</w:t>
+            </w:r>
+            <w:proofErr w:type="spellEnd"/>
           </w:p>
         </w:tc>
         <w:tc>
@@ -2571,12 +2754,10 @@
                 <w:sz w:val="19"/>
                 <w:szCs w:val="19"/>
               </w:rPr>
-              <w:t>Synthetic patient dataset design and SNOMED CT-AU coding plan</w:t>
-            </w:r>
-          </w:p>
-        </w:tc>
-      </w:tr>
-      <w:tr>
+              <w:t>Clinical Data Specialist</w:t>
+            </w:r>
+          </w:p>
+        </w:tc>
         <w:tc>
           <w:tcPr>
             <w:tcW w:w="3120" w:type="dxa"/>
@@ -2599,10 +2780,12 @@
                 <w:sz w:val="19"/>
                 <w:szCs w:val="19"/>
               </w:rPr>
-              <w:t>Rikesh Aryal</w:t>
-            </w:r>
-          </w:p>
-        </w:tc>
+              <w:t>Synthetic patient dataset design and SNOMED CT-AU coding plan</w:t>
+            </w:r>
+          </w:p>
+        </w:tc>
+      </w:tr>
+      <w:tr>
         <w:tc>
           <w:tcPr>
             <w:tcW w:w="3120" w:type="dxa"/>
@@ -2625,7 +2808,7 @@
                 <w:sz w:val="19"/>
                 <w:szCs w:val="19"/>
               </w:rPr>
-              <w:t>Integration &amp; FHIR Specialist</w:t>
+              <w:t>Rikesh Aryal</w:t>
             </w:r>
           </w:p>
         </w:tc>
@@ -2651,7 +2834,55 @@
                 <w:sz w:val="19"/>
                 <w:szCs w:val="19"/>
               </w:rPr>
-              <w:t>Research on MedTalk's FHIR implementation and Best Practice/Halo Connect integration, feeding into the architecture diagram</w:t>
+              <w:t>Integration &amp; FHIR Specialist</w:t>
+            </w:r>
+          </w:p>
+        </w:tc>
+        <w:tc>
+          <w:tcPr>
+            <w:tcW w:w="3120" w:type="dxa"/>
+            <w:tcMar>
+              <w:top w:w="60" w:type="dxa"/>
+              <w:left w:w="90" w:type="dxa"/>
+              <w:bottom w:w="60" w:type="dxa"/>
+              <w:right w:w="90" w:type="dxa"/>
+            </w:tcMar>
+          </w:tcPr>
+          <w:p>
+            <w:pPr>
+              <w:spacing w:before="40" w:after="40"/>
+            </w:pPr>
+            <w:r>
+              <w:rPr>
+                <w:i/>
+                <w:iCs/>
+                <w:color w:val="0563C1"/>
+                <w:sz w:val="19"/>
+                <w:szCs w:val="19"/>
+              </w:rPr>
+              <w:t xml:space="preserve">Research on </w:t>
+            </w:r>
+            <w:proofErr w:type="spellStart"/>
+            <w:r>
+              <w:rPr>
+                <w:i/>
+                <w:iCs/>
+                <w:color w:val="0563C1"/>
+                <w:sz w:val="19"/>
+                <w:szCs w:val="19"/>
+              </w:rPr>
+              <w:t>MedTalk's</w:t>
+            </w:r>
+            <w:proofErr w:type="spellEnd"/>
+            <w:r>
+              <w:rPr>
+                <w:i/>
+                <w:iCs/>
+                <w:color w:val="0563C1"/>
+                <w:sz w:val="19"/>
+                <w:szCs w:val="19"/>
+              </w:rPr>
+              <w:t xml:space="preserve"> FHIR implementation and Best Practice/Halo Connect integration, feeding into the architecture diagram</w:t>
             </w:r>
           </w:p>
         </w:tc>
@@ -2907,52 +3138,9 @@
                 <w:sz w:val="19"/>
                 <w:szCs w:val="19"/>
               </w:rPr>
-              <w:t>FAZ Australia (MedTalk)</w:t>
-            </w:r>
-          </w:p>
-        </w:tc>
-      </w:tr>
-      <w:tr>
-        <w:tc>
-          <w:tcPr>
-            <w:tcW w:w="3000" w:type="dxa"/>
-            <w:shd w:val="clear" w:color="auto" w:fill="F2F5FB"/>
-            <w:tcMar>
-              <w:top w:w="60" w:type="dxa"/>
-              <w:left w:w="90" w:type="dxa"/>
-              <w:bottom w:w="60" w:type="dxa"/>
-              <w:right w:w="90" w:type="dxa"/>
-            </w:tcMar>
-          </w:tcPr>
-          <w:p>
-            <w:pPr>
-              <w:spacing w:before="40" w:after="40"/>
-            </w:pPr>
-            <w:r>
-              <w:rPr>
-                <w:b/>
-                <w:bCs/>
-                <w:sz w:val="20"/>
-                <w:szCs w:val="20"/>
-              </w:rPr>
-              <w:t>Team Members</w:t>
-            </w:r>
-          </w:p>
-        </w:tc>
-        <w:tc>
-          <w:tcPr>
-            <w:tcW w:w="6360" w:type="dxa"/>
-            <w:tcMar>
-              <w:top w:w="60" w:type="dxa"/>
-              <w:left w:w="90" w:type="dxa"/>
-              <w:bottom w:w="60" w:type="dxa"/>
-              <w:right w:w="90" w:type="dxa"/>
-            </w:tcMar>
-          </w:tcPr>
-          <w:p>
-            <w:pPr>
-              <w:spacing w:before="40" w:after="40"/>
-            </w:pPr>
+              <w:t>FAZ Australia (</w:t>
+            </w:r>
+            <w:proofErr w:type="spellStart"/>
             <w:r>
               <w:rPr>
                 <w:i/>
@@ -2961,52 +3149,9 @@
                 <w:sz w:val="19"/>
                 <w:szCs w:val="19"/>
               </w:rPr>
-              <w:t>Sonam Pelden, Charity Gwese, Rikesh Aryal, Zubair Adil Soomro</w:t>
-            </w:r>
-          </w:p>
-        </w:tc>
-      </w:tr>
-      <w:tr>
-        <w:tc>
-          <w:tcPr>
-            <w:tcW w:w="3000" w:type="dxa"/>
-            <w:shd w:val="clear" w:color="auto" w:fill="F2F5FB"/>
-            <w:tcMar>
-              <w:top w:w="60" w:type="dxa"/>
-              <w:left w:w="90" w:type="dxa"/>
-              <w:bottom w:w="60" w:type="dxa"/>
-              <w:right w:w="90" w:type="dxa"/>
-            </w:tcMar>
-          </w:tcPr>
-          <w:p>
-            <w:pPr>
-              <w:spacing w:before="40" w:after="40"/>
-            </w:pPr>
-            <w:r>
-              <w:rPr>
-                <w:b/>
-                <w:bCs/>
-                <w:sz w:val="20"/>
-                <w:szCs w:val="20"/>
-              </w:rPr>
-              <w:t>Project Supervisor</w:t>
-            </w:r>
-          </w:p>
-        </w:tc>
-        <w:tc>
-          <w:tcPr>
-            <w:tcW w:w="6360" w:type="dxa"/>
-            <w:tcMar>
-              <w:top w:w="60" w:type="dxa"/>
-              <w:left w:w="90" w:type="dxa"/>
-              <w:bottom w:w="60" w:type="dxa"/>
-              <w:right w:w="90" w:type="dxa"/>
-            </w:tcMar>
-          </w:tcPr>
-          <w:p>
-            <w:pPr>
-              <w:spacing w:before="40" w:after="40"/>
-            </w:pPr>
+              <w:t>MedTalk</w:t>
+            </w:r>
+            <w:proofErr w:type="spellEnd"/>
             <w:r>
               <w:rPr>
                 <w:i/>
@@ -3015,7 +3160,7 @@
                 <w:sz w:val="19"/>
                 <w:szCs w:val="19"/>
               </w:rPr>
-              <w:t>Md Ashraf Uddin</w:t>
+              <w:t>)</w:t>
             </w:r>
           </w:p>
         </w:tc>
@@ -3043,7 +3188,7 @@
                 <w:sz w:val="20"/>
                 <w:szCs w:val="20"/>
               </w:rPr>
-              <w:t>Date</w:t>
+              <w:t>Team Members</w:t>
             </w:r>
           </w:p>
         </w:tc>
@@ -3069,6 +3214,136 @@
                 <w:sz w:val="19"/>
                 <w:szCs w:val="19"/>
               </w:rPr>
+              <w:t xml:space="preserve">Sonam Pelden, Charity </w:t>
+            </w:r>
+            <w:proofErr w:type="spellStart"/>
+            <w:r>
+              <w:rPr>
+                <w:i/>
+                <w:iCs/>
+                <w:color w:val="0563C1"/>
+                <w:sz w:val="19"/>
+                <w:szCs w:val="19"/>
+              </w:rPr>
+              <w:t>Gwese</w:t>
+            </w:r>
+            <w:proofErr w:type="spellEnd"/>
+            <w:r>
+              <w:rPr>
+                <w:i/>
+                <w:iCs/>
+                <w:color w:val="0563C1"/>
+                <w:sz w:val="19"/>
+                <w:szCs w:val="19"/>
+              </w:rPr>
+              <w:t>, Rikesh Aryal, Zubair Adil Soomro</w:t>
+            </w:r>
+          </w:p>
+        </w:tc>
+      </w:tr>
+      <w:tr>
+        <w:tc>
+          <w:tcPr>
+            <w:tcW w:w="3000" w:type="dxa"/>
+            <w:shd w:val="clear" w:color="auto" w:fill="F2F5FB"/>
+            <w:tcMar>
+              <w:top w:w="60" w:type="dxa"/>
+              <w:left w:w="90" w:type="dxa"/>
+              <w:bottom w:w="60" w:type="dxa"/>
+              <w:right w:w="90" w:type="dxa"/>
+            </w:tcMar>
+          </w:tcPr>
+          <w:p>
+            <w:pPr>
+              <w:spacing w:before="40" w:after="40"/>
+            </w:pPr>
+            <w:r>
+              <w:rPr>
+                <w:b/>
+                <w:bCs/>
+                <w:sz w:val="20"/>
+                <w:szCs w:val="20"/>
+              </w:rPr>
+              <w:t>Project Supervisor</w:t>
+            </w:r>
+          </w:p>
+        </w:tc>
+        <w:tc>
+          <w:tcPr>
+            <w:tcW w:w="6360" w:type="dxa"/>
+            <w:tcMar>
+              <w:top w:w="60" w:type="dxa"/>
+              <w:left w:w="90" w:type="dxa"/>
+              <w:bottom w:w="60" w:type="dxa"/>
+              <w:right w:w="90" w:type="dxa"/>
+            </w:tcMar>
+          </w:tcPr>
+          <w:p>
+            <w:pPr>
+              <w:spacing w:before="40" w:after="40"/>
+            </w:pPr>
+            <w:r>
+              <w:rPr>
+                <w:i/>
+                <w:iCs/>
+                <w:color w:val="0563C1"/>
+                <w:sz w:val="19"/>
+                <w:szCs w:val="19"/>
+              </w:rPr>
+              <w:t>Md Ashraf Uddin</w:t>
+            </w:r>
+          </w:p>
+        </w:tc>
+      </w:tr>
+      <w:tr>
+        <w:tc>
+          <w:tcPr>
+            <w:tcW w:w="3000" w:type="dxa"/>
+            <w:shd w:val="clear" w:color="auto" w:fill="F2F5FB"/>
+            <w:tcMar>
+              <w:top w:w="60" w:type="dxa"/>
+              <w:left w:w="90" w:type="dxa"/>
+              <w:bottom w:w="60" w:type="dxa"/>
+              <w:right w:w="90" w:type="dxa"/>
+            </w:tcMar>
+          </w:tcPr>
+          <w:p>
+            <w:pPr>
+              <w:spacing w:before="40" w:after="40"/>
+            </w:pPr>
+            <w:r>
+              <w:rPr>
+                <w:b/>
+                <w:bCs/>
+                <w:sz w:val="20"/>
+                <w:szCs w:val="20"/>
+              </w:rPr>
+              <w:t>Date</w:t>
+            </w:r>
+          </w:p>
+        </w:tc>
+        <w:tc>
+          <w:tcPr>
+            <w:tcW w:w="6360" w:type="dxa"/>
+            <w:tcMar>
+              <w:top w:w="60" w:type="dxa"/>
+              <w:left w:w="90" w:type="dxa"/>
+              <w:bottom w:w="60" w:type="dxa"/>
+              <w:right w:w="90" w:type="dxa"/>
+            </w:tcMar>
+          </w:tcPr>
+          <w:p>
+            <w:pPr>
+              <w:spacing w:before="40" w:after="40"/>
+            </w:pPr>
+            <w:r>
+              <w:rPr>
+                <w:i/>
+                <w:iCs/>
+                <w:color w:val="0563C1"/>
+                <w:sz w:val="19"/>
+                <w:szCs w:val="19"/>
+              </w:rPr>
               <w:t>27 July 2026</w:t>
             </w:r>
           </w:p>
@@ -3115,7 +3390,117 @@
           <w:sz w:val="20"/>
           <w:szCs w:val="20"/>
         </w:rPr>
-        <w:t xml:space="preserve">  FAZ Australia is a Canberra-based health-technology company whose flagship product, MedTalk, is an AI clinical documentation platform that listens to doctor–patient consultations and automatically drafts structured clinical notes. MedTalk is already used by medical practices across Australia and must connect reliably to the clinical software those practices depend on daily, including practice-management systems such as Best Practice (via its Halo Connect integration tool) and broader hospital record systems, exchanged using the FHIR data standard. As MedTalk's customer base grows, FAZ Australia needs a safe way to test these integrations without risking real patient data. Verifying that MedTalk correctly sends and receives clinical information, correctly maps clinical terminology (SNOMED CT-AU) to billing and diagnostic codes (ICD-10-AM and MBS), and fails gracefully when connections are slow, incorrect, or dropped, would otherwise require testing against live systems, creating unacceptable privacy, compliance and reliability risk. This project addresses that gap by designing and building a synthetic integration test harness: a safe environment populated entirely with made-up patient records that mirrors MedTalk's real-world connections, allowing FAZ Australia's engineers to validate data exchange, code mapping and failure handling before anything goes near a real clinic.</w:t>
+        <w:t xml:space="preserve">  FAZ Australia is a Canberra-based health-technology company whose flagship product, </w:t>
+      </w:r>
+      <w:proofErr w:type="spellStart"/>
+      <w:r>
+        <w:rPr>
+          <w:i/>
+          <w:iCs/>
+          <w:color w:val="0563C1"/>
+          <w:sz w:val="20"/>
+          <w:szCs w:val="20"/>
+        </w:rPr>
+        <w:t>MedTalk</w:t>
+      </w:r>
+      <w:proofErr w:type="spellEnd"/>
+      <w:r>
+        <w:rPr>
+          <w:i/>
+          <w:iCs/>
+          <w:color w:val="0563C1"/>
+          <w:sz w:val="20"/>
+          <w:szCs w:val="20"/>
+        </w:rPr>
+        <w:t xml:space="preserve">, is an AI clinical documentation platform that listens to doctor–patient consultations and automatically drafts structured clinical notes. </w:t>
+      </w:r>
+      <w:proofErr w:type="spellStart"/>
+      <w:r>
+        <w:rPr>
+          <w:i/>
+          <w:iCs/>
+          <w:color w:val="0563C1"/>
+          <w:sz w:val="20"/>
+          <w:szCs w:val="20"/>
+        </w:rPr>
+        <w:t>MedTalk</w:t>
+      </w:r>
+      <w:proofErr w:type="spellEnd"/>
+      <w:r>
+        <w:rPr>
+          <w:i/>
+          <w:iCs/>
+          <w:color w:val="0563C1"/>
+          <w:sz w:val="20"/>
+          <w:szCs w:val="20"/>
+        </w:rPr>
+        <w:t xml:space="preserve"> is already used by medical practices across Australia and must connect reliably to the clinical software those practices depend on daily, including practice-management systems such as Best Practice (via its Halo Connect integration tool) and broader hospital record systems, exchanged using the FHIR data standard. As </w:t>
+      </w:r>
+      <w:proofErr w:type="spellStart"/>
+      <w:r>
+        <w:rPr>
+          <w:i/>
+          <w:iCs/>
+          <w:color w:val="0563C1"/>
+          <w:sz w:val="20"/>
+          <w:szCs w:val="20"/>
+        </w:rPr>
+        <w:t>MedTalk's</w:t>
+      </w:r>
+      <w:proofErr w:type="spellEnd"/>
+      <w:r>
+        <w:rPr>
+          <w:i/>
+          <w:iCs/>
+          <w:color w:val="0563C1"/>
+          <w:sz w:val="20"/>
+          <w:szCs w:val="20"/>
+        </w:rPr>
+        <w:t xml:space="preserve"> customer base grows, FAZ Australia needs a safe way to test these integrations without risking real patient data. Verifying that </w:t>
+      </w:r>
+      <w:proofErr w:type="spellStart"/>
+      <w:r>
+        <w:rPr>
+          <w:i/>
+          <w:iCs/>
+          <w:color w:val="0563C1"/>
+          <w:sz w:val="20"/>
+          <w:szCs w:val="20"/>
+        </w:rPr>
+        <w:t>MedTalk</w:t>
+      </w:r>
+      <w:proofErr w:type="spellEnd"/>
+      <w:r>
+        <w:rPr>
+          <w:i/>
+          <w:iCs/>
+          <w:color w:val="0563C1"/>
+          <w:sz w:val="20"/>
+          <w:szCs w:val="20"/>
+        </w:rPr>
+        <w:t xml:space="preserve"> correctly sends and receives clinical information, correctly maps clinical terminology (SNOMED CT-AU) to billing and diagnostic codes (ICD-10-AM and MBS), and fails gracefully when connections are slow, incorrect, or dropped, would otherwise require testing against live systems, creating unacceptable privacy, compliance and reliability risk. This project addresses that gap by designing and building a synthetic integration test harness: a safe environment populated entirely with made-up patient records that mirrors </w:t>
+      </w:r>
+      <w:proofErr w:type="spellStart"/>
+      <w:r>
+        <w:rPr>
+          <w:i/>
+          <w:iCs/>
+          <w:color w:val="0563C1"/>
+          <w:sz w:val="20"/>
+          <w:szCs w:val="20"/>
+        </w:rPr>
+        <w:t>MedTalk's</w:t>
+      </w:r>
+      <w:proofErr w:type="spellEnd"/>
+      <w:r>
+        <w:rPr>
+          <w:i/>
+          <w:iCs/>
+          <w:color w:val="0563C1"/>
+          <w:sz w:val="20"/>
+          <w:szCs w:val="20"/>
+        </w:rPr>
+        <w:t xml:space="preserve"> real-world connections, allowing FAZ Australia's engineers to validate data exchange, code mapping and failure handling before anything goes near a real clinic.</w:t>
       </w:r>
     </w:p>
     <w:p>
@@ -3158,7 +3543,29 @@
           <w:sz w:val="20"/>
           <w:szCs w:val="20"/>
         </w:rPr>
-        <w:t xml:space="preserve">  Identify and document all data exchange points between MedTalk and external clinical/hospital systems, including the FHIR standard and Best Practice's Halo Connect tool, by the end of Week 6.</w:t>
+        <w:t xml:space="preserve">  Identify and document all data exchange points between </w:t>
+      </w:r>
+      <w:proofErr w:type="spellStart"/>
+      <w:r>
+        <w:rPr>
+          <w:i/>
+          <w:iCs/>
+          <w:color w:val="0563C1"/>
+          <w:sz w:val="20"/>
+          <w:szCs w:val="20"/>
+        </w:rPr>
+        <w:t>MedTalk</w:t>
+      </w:r>
+      <w:proofErr w:type="spellEnd"/>
+      <w:r>
+        <w:rPr>
+          <w:i/>
+          <w:iCs/>
+          <w:color w:val="0563C1"/>
+          <w:sz w:val="20"/>
+          <w:szCs w:val="20"/>
+        </w:rPr>
+        <w:t xml:space="preserve"> and external clinical/hospital systems, including the FHIR standard and Best Practice's Halo Connect tool, by the end of Week 6.</w:t>
       </w:r>
     </w:p>
     <w:p>
@@ -3196,7 +3603,29 @@
           <w:sz w:val="20"/>
           <w:szCs w:val="20"/>
         </w:rPr>
-        <w:t xml:space="preserve">  Produce a written test plan specifying at least five failure conditions (e.g. slow response, malformed data, dropped connection) and expected system behaviour for each, by Week 12.</w:t>
+        <w:t xml:space="preserve">  Produce a written test plan specifying at least five failure conditions (e.g. slow response, malformed data, dropped connection) and expected system </w:t>
+      </w:r>
+      <w:proofErr w:type="spellStart"/>
+      <w:r>
+        <w:rPr>
+          <w:i/>
+          <w:iCs/>
+          <w:color w:val="0563C1"/>
+          <w:sz w:val="20"/>
+          <w:szCs w:val="20"/>
+        </w:rPr>
+        <w:t>behaviour</w:t>
+      </w:r>
+      <w:proofErr w:type="spellEnd"/>
+      <w:r>
+        <w:rPr>
+          <w:i/>
+          <w:iCs/>
+          <w:color w:val="0563C1"/>
+          <w:sz w:val="20"/>
+          <w:szCs w:val="20"/>
+        </w:rPr>
+        <w:t xml:space="preserve"> for each, by Week 12.</w:t>
       </w:r>
     </w:p>
     <w:p>
@@ -3215,7 +3644,51 @@
           <w:sz w:val="20"/>
           <w:szCs w:val="20"/>
         </w:rPr>
-        <w:t xml:space="preserve">  Build and execute an automated test suite that validates MedTalk's integration behaviour against the synthetic environment, producing a pass/fail report, by the end of Semester 2.</w:t>
+        <w:t xml:space="preserve">  Build and execute an automated test suite that validates </w:t>
+      </w:r>
+      <w:proofErr w:type="spellStart"/>
+      <w:r>
+        <w:rPr>
+          <w:i/>
+          <w:iCs/>
+          <w:color w:val="0563C1"/>
+          <w:sz w:val="20"/>
+          <w:szCs w:val="20"/>
+        </w:rPr>
+        <w:t>MedTalk's</w:t>
+      </w:r>
+      <w:proofErr w:type="spellEnd"/>
+      <w:r>
+        <w:rPr>
+          <w:i/>
+          <w:iCs/>
+          <w:color w:val="0563C1"/>
+          <w:sz w:val="20"/>
+          <w:szCs w:val="20"/>
+        </w:rPr>
+        <w:t xml:space="preserve"> integration </w:t>
+      </w:r>
+      <w:proofErr w:type="spellStart"/>
+      <w:r>
+        <w:rPr>
+          <w:i/>
+          <w:iCs/>
+          <w:color w:val="0563C1"/>
+          <w:sz w:val="20"/>
+          <w:szCs w:val="20"/>
+        </w:rPr>
+        <w:t>behaviour</w:t>
+      </w:r>
+      <w:proofErr w:type="spellEnd"/>
+      <w:r>
+        <w:rPr>
+          <w:i/>
+          <w:iCs/>
+          <w:color w:val="0563C1"/>
+          <w:sz w:val="20"/>
+          <w:szCs w:val="20"/>
+        </w:rPr>
+        <w:t xml:space="preserve"> against the synthetic environment, producing a pass/fail report, by the end of Semester 2.</w:t>
       </w:r>
     </w:p>
     <w:p>
@@ -3368,13 +3841,9 @@
                 <w:sz w:val="19"/>
                 <w:szCs w:val="19"/>
               </w:rPr>
-              <w:t>Mapping and testing of the FHIR-based interface between MedTalk and external systems, including Best Practice/Halo Connect</w:t>
-            </w:r>
-          </w:p>
-          <w:p>
-            <w:pPr>
-              <w:spacing w:before="40" w:after="40"/>
-            </w:pPr>
+              <w:t xml:space="preserve">Mapping and testing of the FHIR-based interface between </w:t>
+            </w:r>
+            <w:proofErr w:type="spellStart"/>
             <w:r>
               <w:rPr>
                 <w:i/>
@@ -3383,25 +3852,9 @@
                 <w:sz w:val="19"/>
                 <w:szCs w:val="19"/>
               </w:rPr>
-              <w:lastRenderedPageBreak/>
-              <w:t>Translation testing between SNOMED CT-AU, ICD-10-AM and MBS billing codes, including edge cases</w:t>
-            </w:r>
-          </w:p>
-        </w:tc>
-        <w:tc>
-          <w:tcPr>
-            <w:tcW w:w="4680" w:type="dxa"/>
-            <w:tcMar>
-              <w:top w:w="80" w:type="dxa"/>
-              <w:left w:w="100" w:type="dxa"/>
-              <w:bottom w:w="80" w:type="dxa"/>
-              <w:right w:w="100" w:type="dxa"/>
-            </w:tcMar>
-          </w:tcPr>
-          <w:p>
-            <w:pPr>
-              <w:spacing w:before="40" w:after="40"/>
-            </w:pPr>
+              <w:t>MedTalk</w:t>
+            </w:r>
+            <w:proofErr w:type="spellEnd"/>
             <w:r>
               <w:rPr>
                 <w:i/>
@@ -3410,8 +3863,7 @@
                 <w:sz w:val="19"/>
                 <w:szCs w:val="19"/>
               </w:rPr>
-              <w:lastRenderedPageBreak/>
-              <w:t>Use, storage or processing of any real patient data</w:t>
+              <w:t xml:space="preserve"> and external systems, including Best Practice/Halo Connect</w:t>
             </w:r>
           </w:p>
           <w:p>
@@ -3426,9 +3878,21 @@
                 <w:sz w:val="19"/>
                 <w:szCs w:val="19"/>
               </w:rPr>
-              <w:t>Direct integration with live production hospital or clinic systems</w:t>
-            </w:r>
-          </w:p>
+              <w:lastRenderedPageBreak/>
+              <w:t>Translation testing between SNOMED CT-AU, ICD-10-AM and MBS billing codes, including edge cases</w:t>
+            </w:r>
+          </w:p>
+        </w:tc>
+        <w:tc>
+          <w:tcPr>
+            <w:tcW w:w="4680" w:type="dxa"/>
+            <w:tcMar>
+              <w:top w:w="80" w:type="dxa"/>
+              <w:left w:w="100" w:type="dxa"/>
+              <w:bottom w:w="80" w:type="dxa"/>
+              <w:right w:w="100" w:type="dxa"/>
+            </w:tcMar>
+          </w:tcPr>
           <w:p>
             <w:pPr>
               <w:spacing w:before="40" w:after="40"/>
@@ -3441,7 +3905,61 @@
                 <w:sz w:val="19"/>
                 <w:szCs w:val="19"/>
               </w:rPr>
-              <w:t>Clinical decision-making or diagnostic features of the MedTalk product itself</w:t>
+              <w:lastRenderedPageBreak/>
+              <w:t>Use, storage or processing of any real patient data</w:t>
+            </w:r>
+          </w:p>
+          <w:p>
+            <w:pPr>
+              <w:spacing w:before="40" w:after="40"/>
+            </w:pPr>
+            <w:r>
+              <w:rPr>
+                <w:i/>
+                <w:iCs/>
+                <w:color w:val="0563C1"/>
+                <w:sz w:val="19"/>
+                <w:szCs w:val="19"/>
+              </w:rPr>
+              <w:t>Direct integration with live production hospital or clinic systems</w:t>
+            </w:r>
+          </w:p>
+          <w:p>
+            <w:pPr>
+              <w:spacing w:before="40" w:after="40"/>
+            </w:pPr>
+            <w:r>
+              <w:rPr>
+                <w:i/>
+                <w:iCs/>
+                <w:color w:val="0563C1"/>
+                <w:sz w:val="19"/>
+                <w:szCs w:val="19"/>
+              </w:rPr>
+              <w:lastRenderedPageBreak/>
+              <w:t xml:space="preserve">Clinical decision-making or diagnostic features of the </w:t>
+            </w:r>
+            <w:proofErr w:type="spellStart"/>
+            <w:r>
+              <w:rPr>
+                <w:i/>
+                <w:iCs/>
+                <w:color w:val="0563C1"/>
+                <w:sz w:val="19"/>
+                <w:szCs w:val="19"/>
+              </w:rPr>
+              <w:t>MedTalk</w:t>
+            </w:r>
+            <w:proofErr w:type="spellEnd"/>
+            <w:r>
+              <w:rPr>
+                <w:i/>
+                <w:iCs/>
+                <w:color w:val="0563C1"/>
+                <w:sz w:val="19"/>
+                <w:szCs w:val="19"/>
+              </w:rPr>
+              <w:t xml:space="preserve"> product itself</w:t>
             </w:r>
           </w:p>
         </w:tc>
@@ -3460,6 +3978,7 @@
           <w:sz w:val="22"/>
           <w:szCs w:val="22"/>
         </w:rPr>
+        <w:lastRenderedPageBreak/>
         <w:t>5. Deliverables for Weeks 1–5</w:t>
       </w:r>
     </w:p>
@@ -4119,6 +4638,7 @@
             <w:pPr>
               <w:spacing w:before="40" w:after="40"/>
             </w:pPr>
+            <w:proofErr w:type="spellStart"/>
             <w:r>
               <w:rPr>
                 <w:i/>
@@ -4127,24 +4647,9 @@
                 <w:sz w:val="19"/>
                 <w:szCs w:val="19"/>
               </w:rPr>
-              <w:t>MedTalk Engineering Team</w:t>
-            </w:r>
-          </w:p>
-        </w:tc>
-        <w:tc>
-          <w:tcPr>
-            <w:tcW w:w="1360" w:type="dxa"/>
-            <w:tcMar>
-              <w:top w:w="50" w:type="dxa"/>
-              <w:left w:w="70" w:type="dxa"/>
-              <w:bottom w:w="50" w:type="dxa"/>
-              <w:right w:w="70" w:type="dxa"/>
-            </w:tcMar>
-          </w:tcPr>
-          <w:p>
-            <w:pPr>
-              <w:spacing w:before="40" w:after="40"/>
-            </w:pPr>
+              <w:t>MedTalk</w:t>
+            </w:r>
+            <w:proofErr w:type="spellEnd"/>
             <w:r>
               <w:rPr>
                 <w:i/>
@@ -4153,13 +4658,13 @@
                 <w:sz w:val="19"/>
                 <w:szCs w:val="19"/>
               </w:rPr>
-              <w:t>Technical stakeholder</w:t>
-            </w:r>
-          </w:p>
-        </w:tc>
-        <w:tc>
-          <w:tcPr>
-            <w:tcW w:w="1960" w:type="dxa"/>
+              <w:t xml:space="preserve"> Engineering Team</w:t>
+            </w:r>
+          </w:p>
+        </w:tc>
+        <w:tc>
+          <w:tcPr>
+            <w:tcW w:w="1360" w:type="dxa"/>
             <w:tcMar>
               <w:top w:w="50" w:type="dxa"/>
               <w:left w:w="70" w:type="dxa"/>
@@ -4179,13 +4684,13 @@
                 <w:sz w:val="19"/>
                 <w:szCs w:val="19"/>
               </w:rPr>
-              <w:t>Clear test coverage and a usable, documented test harness</w:t>
-            </w:r>
-          </w:p>
-        </w:tc>
-        <w:tc>
-          <w:tcPr>
-            <w:tcW w:w="1160" w:type="dxa"/>
+              <w:t>Technical stakeholder</w:t>
+            </w:r>
+          </w:p>
+        </w:tc>
+        <w:tc>
+          <w:tcPr>
+            <w:tcW w:w="1960" w:type="dxa"/>
             <w:tcMar>
               <w:top w:w="50" w:type="dxa"/>
               <w:left w:w="70" w:type="dxa"/>
@@ -4205,7 +4710,7 @@
                 <w:sz w:val="19"/>
                 <w:szCs w:val="19"/>
               </w:rPr>
-              <w:t>High</w:t>
+              <w:t>Clear test coverage and a usable, documented test harness</w:t>
             </w:r>
           </w:p>
         </w:tc>
@@ -4231,13 +4736,13 @@
                 <w:sz w:val="19"/>
                 <w:szCs w:val="19"/>
               </w:rPr>
-              <w:t>Medium</w:t>
-            </w:r>
-          </w:p>
-        </w:tc>
-        <w:tc>
-          <w:tcPr>
-            <w:tcW w:w="2200" w:type="dxa"/>
+              <w:t>High</w:t>
+            </w:r>
+          </w:p>
+        </w:tc>
+        <w:tc>
+          <w:tcPr>
+            <w:tcW w:w="1160" w:type="dxa"/>
             <w:tcMar>
               <w:top w:w="50" w:type="dxa"/>
               <w:left w:w="70" w:type="dxa"/>
@@ -4257,15 +4762,13 @@
                 <w:sz w:val="19"/>
                 <w:szCs w:val="19"/>
               </w:rPr>
-              <w:t>Async via email/Slack, referenced in weekly call notes</w:t>
-            </w:r>
-          </w:p>
-        </w:tc>
-      </w:tr>
-      <w:tr>
-        <w:tc>
-          <w:tcPr>
-            <w:tcW w:w="1560" w:type="dxa"/>
+              <w:t>Medium</w:t>
+            </w:r>
+          </w:p>
+        </w:tc>
+        <w:tc>
+          <w:tcPr>
+            <w:tcW w:w="2200" w:type="dxa"/>
             <w:tcMar>
               <w:top w:w="50" w:type="dxa"/>
               <w:left w:w="70" w:type="dxa"/>
@@ -4285,13 +4788,15 @@
                 <w:sz w:val="19"/>
                 <w:szCs w:val="19"/>
               </w:rPr>
-              <w:t>CIHE Academic Supervisor</w:t>
-            </w:r>
-          </w:p>
-        </w:tc>
-        <w:tc>
-          <w:tcPr>
-            <w:tcW w:w="1360" w:type="dxa"/>
+              <w:t>Async via email/Slack, referenced in weekly call notes</w:t>
+            </w:r>
+          </w:p>
+        </w:tc>
+      </w:tr>
+      <w:tr>
+        <w:tc>
+          <w:tcPr>
+            <w:tcW w:w="1560" w:type="dxa"/>
             <w:tcMar>
               <w:top w:w="50" w:type="dxa"/>
               <w:left w:w="70" w:type="dxa"/>
@@ -4311,13 +4816,13 @@
                 <w:sz w:val="19"/>
                 <w:szCs w:val="19"/>
               </w:rPr>
-              <w:t>Project supervisor / assessor</w:t>
-            </w:r>
-          </w:p>
-        </w:tc>
-        <w:tc>
-          <w:tcPr>
-            <w:tcW w:w="1960" w:type="dxa"/>
+              <w:t>CIHE Academic Supervisor</w:t>
+            </w:r>
+          </w:p>
+        </w:tc>
+        <w:tc>
+          <w:tcPr>
+            <w:tcW w:w="1360" w:type="dxa"/>
             <w:tcMar>
               <w:top w:w="50" w:type="dxa"/>
               <w:left w:w="70" w:type="dxa"/>
@@ -4337,13 +4842,13 @@
                 <w:sz w:val="19"/>
                 <w:szCs w:val="19"/>
               </w:rPr>
-              <w:t>Project meets rubric requirements and academic standards</w:t>
-            </w:r>
-          </w:p>
-        </w:tc>
-        <w:tc>
-          <w:tcPr>
-            <w:tcW w:w="1160" w:type="dxa"/>
+              <w:t>Project supervisor / assessor</w:t>
+            </w:r>
+          </w:p>
+        </w:tc>
+        <w:tc>
+          <w:tcPr>
+            <w:tcW w:w="1960" w:type="dxa"/>
             <w:tcMar>
               <w:top w:w="50" w:type="dxa"/>
               <w:left w:w="70" w:type="dxa"/>
@@ -4363,7 +4868,7 @@
                 <w:sz w:val="19"/>
                 <w:szCs w:val="19"/>
               </w:rPr>
-              <w:t>Medium</w:t>
+              <w:t>Project meets rubric requirements and academic standards</w:t>
             </w:r>
           </w:p>
         </w:tc>
@@ -4389,13 +4894,13 @@
                 <w:sz w:val="19"/>
                 <w:szCs w:val="19"/>
               </w:rPr>
-              <w:t>High</w:t>
-            </w:r>
-          </w:p>
-        </w:tc>
-        <w:tc>
-          <w:tcPr>
-            <w:tcW w:w="2200" w:type="dxa"/>
+              <w:t>Medium</w:t>
+            </w:r>
+          </w:p>
+        </w:tc>
+        <w:tc>
+          <w:tcPr>
+            <w:tcW w:w="1160" w:type="dxa"/>
             <w:tcMar>
               <w:top w:w="50" w:type="dxa"/>
               <w:left w:w="70" w:type="dxa"/>
@@ -4415,15 +4920,13 @@
                 <w:sz w:val="19"/>
                 <w:szCs w:val="19"/>
               </w:rPr>
-              <w:t>Weekly Teams check-in</w:t>
-            </w:r>
-          </w:p>
-        </w:tc>
-      </w:tr>
-      <w:tr>
-        <w:tc>
-          <w:tcPr>
-            <w:tcW w:w="1560" w:type="dxa"/>
+              <w:t>High</w:t>
+            </w:r>
+          </w:p>
+        </w:tc>
+        <w:tc>
+          <w:tcPr>
+            <w:tcW w:w="2200" w:type="dxa"/>
             <w:tcMar>
               <w:top w:w="50" w:type="dxa"/>
               <w:left w:w="70" w:type="dxa"/>
@@ -4443,13 +4946,15 @@
                 <w:sz w:val="19"/>
                 <w:szCs w:val="19"/>
               </w:rPr>
-              <w:t>Project Team Members</w:t>
-            </w:r>
-          </w:p>
-        </w:tc>
-        <w:tc>
-          <w:tcPr>
-            <w:tcW w:w="1360" w:type="dxa"/>
+              <w:t>Weekly Teams check-in</w:t>
+            </w:r>
+          </w:p>
+        </w:tc>
+      </w:tr>
+      <w:tr>
+        <w:tc>
+          <w:tcPr>
+            <w:tcW w:w="1560" w:type="dxa"/>
             <w:tcMar>
               <w:top w:w="50" w:type="dxa"/>
               <w:left w:w="70" w:type="dxa"/>
@@ -4469,13 +4974,13 @@
                 <w:sz w:val="19"/>
                 <w:szCs w:val="19"/>
               </w:rPr>
-              <w:t>Delivery team</w:t>
-            </w:r>
-          </w:p>
-        </w:tc>
-        <w:tc>
-          <w:tcPr>
-            <w:tcW w:w="1960" w:type="dxa"/>
+              <w:t>Project Team Members</w:t>
+            </w:r>
+          </w:p>
+        </w:tc>
+        <w:tc>
+          <w:tcPr>
+            <w:tcW w:w="1360" w:type="dxa"/>
             <w:tcMar>
               <w:top w:w="50" w:type="dxa"/>
               <w:left w:w="70" w:type="dxa"/>
@@ -4495,13 +5000,13 @@
                 <w:sz w:val="19"/>
                 <w:szCs w:val="19"/>
               </w:rPr>
-              <w:t>Clear task allocation, workable scope and shared understanding</w:t>
-            </w:r>
-          </w:p>
-        </w:tc>
-        <w:tc>
-          <w:tcPr>
-            <w:tcW w:w="1160" w:type="dxa"/>
+              <w:t>Delivery team</w:t>
+            </w:r>
+          </w:p>
+        </w:tc>
+        <w:tc>
+          <w:tcPr>
+            <w:tcW w:w="1960" w:type="dxa"/>
             <w:tcMar>
               <w:top w:w="50" w:type="dxa"/>
               <w:left w:w="70" w:type="dxa"/>
@@ -4521,7 +5026,7 @@
                 <w:sz w:val="19"/>
                 <w:szCs w:val="19"/>
               </w:rPr>
-              <w:t>High</w:t>
+              <w:t>Clear task allocation, workable scope and shared understanding</w:t>
             </w:r>
           </w:p>
         </w:tc>
@@ -4547,13 +5052,13 @@
                 <w:sz w:val="19"/>
                 <w:szCs w:val="19"/>
               </w:rPr>
-              <w:t>Medium</w:t>
-            </w:r>
-          </w:p>
-        </w:tc>
-        <w:tc>
-          <w:tcPr>
-            <w:tcW w:w="2200" w:type="dxa"/>
+              <w:t>High</w:t>
+            </w:r>
+          </w:p>
+        </w:tc>
+        <w:tc>
+          <w:tcPr>
+            <w:tcW w:w="1160" w:type="dxa"/>
             <w:tcMar>
               <w:top w:w="50" w:type="dxa"/>
               <w:left w:w="70" w:type="dxa"/>
@@ -4573,15 +5078,13 @@
                 <w:sz w:val="19"/>
                 <w:szCs w:val="19"/>
               </w:rPr>
-              <w:t>Daily Teams/Discord updates</w:t>
-            </w:r>
-          </w:p>
-        </w:tc>
-      </w:tr>
-      <w:tr>
-        <w:tc>
-          <w:tcPr>
-            <w:tcW w:w="1560" w:type="dxa"/>
+              <w:t>Medium</w:t>
+            </w:r>
+          </w:p>
+        </w:tc>
+        <w:tc>
+          <w:tcPr>
+            <w:tcW w:w="2200" w:type="dxa"/>
             <w:tcMar>
               <w:top w:w="50" w:type="dxa"/>
               <w:left w:w="70" w:type="dxa"/>
@@ -4601,7 +5104,57 @@
                 <w:sz w:val="19"/>
                 <w:szCs w:val="19"/>
               </w:rPr>
-              <w:t>Future MedTalk Clinician Users</w:t>
+              <w:t>Daily Teams/Discord updates</w:t>
+            </w:r>
+          </w:p>
+        </w:tc>
+      </w:tr>
+      <w:tr>
+        <w:tc>
+          <w:tcPr>
+            <w:tcW w:w="1560" w:type="dxa"/>
+            <w:tcMar>
+              <w:top w:w="50" w:type="dxa"/>
+              <w:left w:w="70" w:type="dxa"/>
+              <w:bottom w:w="50" w:type="dxa"/>
+              <w:right w:w="70" w:type="dxa"/>
+            </w:tcMar>
+          </w:tcPr>
+          <w:p>
+            <w:pPr>
+              <w:spacing w:before="40" w:after="40"/>
+            </w:pPr>
+            <w:r>
+              <w:rPr>
+                <w:i/>
+                <w:iCs/>
+                <w:color w:val="0563C1"/>
+                <w:sz w:val="19"/>
+                <w:szCs w:val="19"/>
+              </w:rPr>
+              <w:t xml:space="preserve">Future </w:t>
+            </w:r>
+            <w:proofErr w:type="spellStart"/>
+            <w:r>
+              <w:rPr>
+                <w:i/>
+                <w:iCs/>
+                <w:color w:val="0563C1"/>
+                <w:sz w:val="19"/>
+                <w:szCs w:val="19"/>
+              </w:rPr>
+              <w:t>MedTalk</w:t>
+            </w:r>
+            <w:proofErr w:type="spellEnd"/>
+            <w:r>
+              <w:rPr>
+                <w:i/>
+                <w:iCs/>
+                <w:color w:val="0563C1"/>
+                <w:sz w:val="19"/>
+                <w:szCs w:val="19"/>
+              </w:rPr>
+              <w:t xml:space="preserve"> Clinician Users</w:t>
             </w:r>
           </w:p>
         </w:tc>
@@ -4941,8 +5494,9 @@
           <w:sz w:val="20"/>
           <w:szCs w:val="20"/>
         </w:rPr>
+        <w:lastRenderedPageBreak/>
         <w:drawing>
-          <wp:inline distT="0" distB="0" distL="0" distR="0" wp14:anchorId="78291941" wp14:editId="321CC465">
+          <wp:inline distT="0" distB="0" distL="0" distR="0" wp14:anchorId="78291941" wp14:editId="4F0FEB7F">
             <wp:extent cx="6400800" cy="4946073"/>
             <wp:effectExtent l="0" t="0" r="0" b="0"/>
             <wp:docPr id="564677343" name="Picture 2"/>
@@ -4957,7 +5511,7 @@
                     <pic:cNvPicPr/>
                   </pic:nvPicPr>
                   <pic:blipFill>
-                    <a:blip r:embed="rId20" cstate="print">
+                    <a:blip r:embed="rId10" cstate="print">
                       <a:extLst>
                         <a:ext uri="{28A0092B-C50C-407E-A947-70E740481C1C}">
                           <a14:useLocalDpi xmlns:a14="http://schemas.microsoft.com/office/drawing/2010/main" val="0"/>
@@ -5007,7 +5561,7 @@
           <w:sz w:val="20"/>
           <w:szCs w:val="20"/>
         </w:rPr>
-        <w:t xml:space="preserve">Figure 1. Power–interest matrix, Week 1</w:t>
+        <w:t>Figure 1. Power–interest matrix, Week 1</w:t>
       </w:r>
     </w:p>
     <w:p>
@@ -5050,9 +5604,29 @@
           <w:sz w:val="20"/>
           <w:szCs w:val="20"/>
         </w:rPr>
-        <w:t xml:space="preserve">  Stakeholders are engaged differently depending on their position in the power–interest matrix. High-power, high-interest stakeholders — the FAZ Australia industry supervisor and the CIHE academic supervisor — are managed closely through weekly video calls and written progress notes, so they can raise concerns early and approve key decisions such as scope changes. High-interest, lower-power stakeholders, such as the MedTalk engineering team and the project team itself, are kept informed through regular asynchronous updates in Slack/Teams and shared Jira boards, so they stay aligned without attending every meeting. Lower-interest stakeholders with moderate influence, such as Best Practice and hospital system vendors, are monitored rather than actively consulted, since the project only needs to comply with their published </w:t>
-        <w:lastRenderedPageBreak/>
-        <w:t>standards. Low-power, low-interest stakeholders, such as future clinician end-users, are represented indirectly through FAZ Australia and require no direct engagement at this stage.</w:t>
+        <w:t xml:space="preserve">  Stakeholders are engaged differently depending on their position in the power–interest matrix. High-power, high-interest stakeholders — the FAZ Australia industry supervisor and the CIHE academic supervisor — are managed closely through weekly video calls and written progress notes, so they can raise concerns early and approve key decisions such as scope changes. High-interest, lower-power stakeholders, such as the </w:t>
+      </w:r>
+      <w:proofErr w:type="spellStart"/>
+      <w:r>
+        <w:rPr>
+          <w:i/>
+          <w:iCs/>
+          <w:color w:val="0563C1"/>
+          <w:sz w:val="20"/>
+          <w:szCs w:val="20"/>
+        </w:rPr>
+        <w:t>MedTalk</w:t>
+      </w:r>
+      <w:proofErr w:type="spellEnd"/>
+      <w:r>
+        <w:rPr>
+          <w:i/>
+          <w:iCs/>
+          <w:color w:val="0563C1"/>
+          <w:sz w:val="20"/>
+          <w:szCs w:val="20"/>
+        </w:rPr>
+        <w:t xml:space="preserve"> engineering team and the project team itself, are kept informed through regular asynchronous updates in Slack/Teams and shared Jira boards, so they stay aligned without attending every meeting. Lower-interest stakeholders with moderate influence, such as Best Practice and hospital system vendors, are monitored rather than actively consulted, since the project only needs to comply with their published standards. Low-power, low-interest stakeholders, such as future clinician end-users, are represented indirectly through FAZ Australia and require no direct engagement at this stage.</w:t>
       </w:r>
     </w:p>
     <w:p>
@@ -5335,7 +5909,7 @@
                 <w:sz w:val="20"/>
                 <w:szCs w:val="20"/>
               </w:rPr>
-              <w:t>Not yet — to invite Md Ashraf Uddin now that the supervisor is confirmed</w:t>
+              <w:t xml:space="preserve">Not yet </w:t>
             </w:r>
           </w:p>
         </w:tc>
@@ -5478,7 +6052,7 @@
                     <pic:cNvPicPr/>
                   </pic:nvPicPr>
                   <pic:blipFill>
-                    <a:blip r:embed="rId10" cstate="print">
+                    <a:blip r:embed="rId11" cstate="print">
                       <a:extLst>
                         <a:ext uri="{28A0092B-C50C-407E-A947-70E740481C1C}">
                           <a14:useLocalDpi xmlns:a14="http://schemas.microsoft.com/office/drawing/2010/main" val="0"/>
@@ -5611,7 +6185,15 @@
         <w:spacing w:after="120" w:line="276" w:lineRule="auto"/>
       </w:pPr>
       <w:r>
-        <w:t>Write 150–200 words explaining your assigned role, the specific outputs you will own this week, and one risk to effective teamwork. Add one Jira task assigned to yourself and make one meaningful GitHub contribution. (This supports the Part B individual reflection due in Week 5.)</w:t>
+        <w:t xml:space="preserve">Write 150–200 words explaining your assigned role, the specific outputs you will own this week, and one risk to effective teamwork. Add one Jira task assigned to yourself and make one meaningful GitHub contribution. (This supports </w:t>
+      </w:r>
+      <w:proofErr w:type="gramStart"/>
+      <w:r>
+        <w:t>the Part</w:t>
+      </w:r>
+      <w:proofErr w:type="gramEnd"/>
+      <w:r>
+        <w:t xml:space="preserve"> B individual reflection due in Week 5.)</w:t>
       </w:r>
     </w:p>
     <w:p>
@@ -5646,7 +6228,95 @@
           <w:sz w:val="20"/>
           <w:szCs w:val="20"/>
         </w:rPr>
-        <w:t xml:space="preserve">  This week, my role is Business Analyst and Documentation Lead for the Healthcare Integration &amp; Clinical Terminology Test Harness project with FAZ Australia (MedTalk). My outputs this week are the project charter, including background research on FAZ Australia and MedTalk, the SMART objectives, and the scope boundaries, as well as leading the stakeholder analysis and drafting the engagement strategy. I am also responsible for setting up the shared documentation structure in GitHub so the team's evidence stays organised from Week 1 onward. One risk to effective teamwork this week is uneven participation: because documentation tasks can be completed quickly by one person, there is a risk that I end up doing most of the written work while other members' contributions are less visible in Jira and GitHub. To manage this, I plan to assign clearly separated Jira tasks to each member early and check in during our weekly meeting to make sure everyone's evidence is being logged individually.</w:t>
+        <w:t xml:space="preserve">  This week, my role is Business Analyst and Documentation Lead for the Healthcare Integration &amp; Clinical Terminology Test Harness project with FAZ Australia (</w:t>
+      </w:r>
+      <w:proofErr w:type="spellStart"/>
+      <w:r>
+        <w:rPr>
+          <w:i/>
+          <w:iCs/>
+          <w:color w:val="0563C1"/>
+          <w:sz w:val="20"/>
+          <w:szCs w:val="20"/>
+        </w:rPr>
+        <w:t>MedTalk</w:t>
+      </w:r>
+      <w:proofErr w:type="spellEnd"/>
+      <w:r>
+        <w:rPr>
+          <w:i/>
+          <w:iCs/>
+          <w:color w:val="0563C1"/>
+          <w:sz w:val="20"/>
+          <w:szCs w:val="20"/>
+        </w:rPr>
+        <w:t xml:space="preserve">). My outputs this week are the project charter, including background research on FAZ Australia and </w:t>
+      </w:r>
+      <w:proofErr w:type="spellStart"/>
+      <w:r>
+        <w:rPr>
+          <w:i/>
+          <w:iCs/>
+          <w:color w:val="0563C1"/>
+          <w:sz w:val="20"/>
+          <w:szCs w:val="20"/>
+        </w:rPr>
+        <w:t>MedTalk</w:t>
+      </w:r>
+      <w:proofErr w:type="spellEnd"/>
+      <w:r>
+        <w:rPr>
+          <w:i/>
+          <w:iCs/>
+          <w:color w:val="0563C1"/>
+          <w:sz w:val="20"/>
+          <w:szCs w:val="20"/>
+        </w:rPr>
+        <w:t xml:space="preserve">, the SMART objectives, and the scope boundaries, as well as leading the stakeholder analysis and drafting the engagement strategy. I am also responsible for setting up the shared documentation structure in </w:t>
+      </w:r>
+      <w:proofErr w:type="gramStart"/>
+      <w:r>
+        <w:rPr>
+          <w:i/>
+          <w:iCs/>
+          <w:color w:val="0563C1"/>
+          <w:sz w:val="20"/>
+          <w:szCs w:val="20"/>
+        </w:rPr>
+        <w:t>GitHub</w:t>
+      </w:r>
+      <w:proofErr w:type="gramEnd"/>
+      <w:r>
+        <w:rPr>
+          <w:i/>
+          <w:iCs/>
+          <w:color w:val="0563C1"/>
+          <w:sz w:val="20"/>
+          <w:szCs w:val="20"/>
+        </w:rPr>
+        <w:t xml:space="preserve"> so the team's evidence stays </w:t>
+      </w:r>
+      <w:proofErr w:type="spellStart"/>
+      <w:r>
+        <w:rPr>
+          <w:i/>
+          <w:iCs/>
+          <w:color w:val="0563C1"/>
+          <w:sz w:val="20"/>
+          <w:szCs w:val="20"/>
+        </w:rPr>
+        <w:t>organised</w:t>
+      </w:r>
+      <w:proofErr w:type="spellEnd"/>
+      <w:r>
+        <w:rPr>
+          <w:i/>
+          <w:iCs/>
+          <w:color w:val="0563C1"/>
+          <w:sz w:val="20"/>
+          <w:szCs w:val="20"/>
+        </w:rPr>
+        <w:t xml:space="preserve"> from Week 1 onward. One risk to effective teamwork this week is uneven participation: because documentation tasks can be completed quickly by one person, there is a risk that I end up doing most of the written work while other members' contributions are less visible in Jira and GitHub. To manage this, I plan to assign clearly separated Jira tasks to each member early and check in during our weekly meeting to make sure everyone's evidence is being logged individually.</w:t>
       </w:r>
     </w:p>
     <w:p>
@@ -5683,8 +6353,8 @@
         <w:tblLook w:val="0000" w:firstRow="0" w:lastRow="0" w:firstColumn="0" w:lastColumn="0" w:noHBand="0" w:noVBand="0"/>
       </w:tblPr>
       <w:tblGrid>
-        <w:gridCol w:w="3600"/>
-        <w:gridCol w:w="5760"/>
+        <w:gridCol w:w="844"/>
+        <w:gridCol w:w="9226"/>
       </w:tblGrid>
       <w:tr>
         <w:tc>
@@ -5926,6 +6596,7 @@
       <w:pPr>
         <w:spacing w:after="70"/>
       </w:pPr>
+      <w:proofErr w:type="gramStart"/>
       <w:r>
         <w:rPr>
           <w:color w:val="1F3864"/>
@@ -5935,13 +6606,18 @@
         <w:t xml:space="preserve">☐  </w:t>
       </w:r>
       <w:r>
-        <w:t>Project charter draft (Task 1.2 completed above)</w:t>
+        <w:t>Project</w:t>
+      </w:r>
+      <w:proofErr w:type="gramEnd"/>
+      <w:r>
+        <w:t xml:space="preserve"> charter draft (Task 1.2 completed above)</w:t>
       </w:r>
     </w:p>
     <w:p>
       <w:pPr>
         <w:spacing w:after="70"/>
       </w:pPr>
+      <w:proofErr w:type="gramStart"/>
       <w:r>
         <w:rPr>
           <w:color w:val="1F3864"/>
@@ -5951,13 +6627,18 @@
         <w:t xml:space="preserve">☐  </w:t>
       </w:r>
       <w:r>
-        <w:t>Stakeholder register and power–interest matrix (Task 1.3)</w:t>
+        <w:t>Stakeholder</w:t>
+      </w:r>
+      <w:proofErr w:type="gramEnd"/>
+      <w:r>
+        <w:t xml:space="preserve"> register and power–interest matrix (Task 1.3)</w:t>
       </w:r>
     </w:p>
     <w:p>
       <w:pPr>
         <w:spacing w:after="70"/>
       </w:pPr>
+      <w:proofErr w:type="gramStart"/>
       <w:r>
         <w:rPr>
           <w:color w:val="1F3864"/>
@@ -5967,13 +6648,18 @@
         <w:t xml:space="preserve">☐  </w:t>
       </w:r>
       <w:r>
-        <w:t>Team working agreement (Task 1.1)</w:t>
+        <w:t>Team</w:t>
+      </w:r>
+      <w:proofErr w:type="gramEnd"/>
+      <w:r>
+        <w:t xml:space="preserve"> working agreement (Task 1.1)</w:t>
       </w:r>
     </w:p>
     <w:p>
       <w:pPr>
         <w:spacing w:after="70"/>
       </w:pPr>
+      <w:proofErr w:type="gramStart"/>
       <w:r>
         <w:rPr>
           <w:color w:val="1F3864"/>
@@ -5983,13 +6669,18 @@
         <w:t xml:space="preserve">☐  </w:t>
       </w:r>
       <w:r>
-        <w:t>Jira project link and screenshot showing assigned tasks</w:t>
+        <w:t>Jira</w:t>
+      </w:r>
+      <w:proofErr w:type="gramEnd"/>
+      <w:r>
+        <w:t xml:space="preserve"> project link and screenshot showing assigned tasks</w:t>
       </w:r>
     </w:p>
     <w:p>
       <w:pPr>
         <w:spacing w:after="70"/>
       </w:pPr>
+      <w:proofErr w:type="gramStart"/>
       <w:r>
         <w:rPr>
           <w:color w:val="1F3864"/>
@@ -5999,13 +6690,18 @@
         <w:t xml:space="preserve">☐  </w:t>
       </w:r>
       <w:r>
-        <w:t>GitHub repository link and screenshot showing folder structure</w:t>
+        <w:t>GitHub</w:t>
+      </w:r>
+      <w:proofErr w:type="gramEnd"/>
+      <w:r>
+        <w:t xml:space="preserve"> repository link and screenshot showing folder structure</w:t>
       </w:r>
     </w:p>
     <w:p>
       <w:pPr>
         <w:spacing w:after="70"/>
       </w:pPr>
+      <w:proofErr w:type="gramStart"/>
       <w:r>
         <w:rPr>
           <w:color w:val="1F3864"/>
@@ -6015,13 +6711,26 @@
         <w:t xml:space="preserve">☐  </w:t>
       </w:r>
       <w:r>
-        <w:t>Each member's 150–200 word contribution statement</w:t>
+        <w:t>Each</w:t>
+      </w:r>
+      <w:proofErr w:type="gramEnd"/>
+      <w:r>
+        <w:t xml:space="preserve"> member's 150–</w:t>
+      </w:r>
+      <w:proofErr w:type="gramStart"/>
+      <w:r>
+        <w:t>200 word</w:t>
+      </w:r>
+      <w:proofErr w:type="gramEnd"/>
+      <w:r>
+        <w:t xml:space="preserve"> contribution statement</w:t>
       </w:r>
     </w:p>
     <w:p>
       <w:pPr>
         <w:spacing w:after="70"/>
       </w:pPr>
+      <w:proofErr w:type="gramStart"/>
       <w:r>
         <w:rPr>
           <w:color w:val="1F3864"/>
@@ -6031,7 +6740,11 @@
         <w:t xml:space="preserve">☐  </w:t>
       </w:r>
       <w:r>
-        <w:t>Supervisor invited to both Jira and GitHub</w:t>
+        <w:t>Supervisor</w:t>
+      </w:r>
+      <w:proofErr w:type="gramEnd"/>
+      <w:r>
+        <w:t xml:space="preserve"> invited to both Jira and GitHub</w:t>
       </w:r>
     </w:p>
     <w:p>
@@ -6159,7 +6872,25 @@
                 <w:sz w:val="20"/>
                 <w:szCs w:val="20"/>
               </w:rPr>
-              <w:t>Students describe instead of analyse.</w:t>
+              <w:t xml:space="preserve">Students describe instead of </w:t>
+            </w:r>
+            <w:proofErr w:type="spellStart"/>
+            <w:proofErr w:type="gramStart"/>
+            <w:r>
+              <w:rPr>
+                <w:sz w:val="20"/>
+                <w:szCs w:val="20"/>
+              </w:rPr>
+              <w:t>analyse</w:t>
+            </w:r>
+            <w:proofErr w:type="spellEnd"/>
+            <w:proofErr w:type="gramEnd"/>
+            <w:r>
+              <w:rPr>
+                <w:sz w:val="20"/>
+                <w:szCs w:val="20"/>
+              </w:rPr>
+              <w:t>.</w:t>
             </w:r>
           </w:p>
           <w:p>
@@ -6183,7 +6914,23 @@
                 <w:sz w:val="20"/>
                 <w:szCs w:val="20"/>
               </w:rPr>
-              <w:t>Requirements are vague, untestable or solution-biased.</w:t>
+              <w:t xml:space="preserve">Requirements are vague, untestable or </w:t>
+            </w:r>
+            <w:proofErr w:type="gramStart"/>
+            <w:r>
+              <w:rPr>
+                <w:sz w:val="20"/>
+                <w:szCs w:val="20"/>
+              </w:rPr>
+              <w:t>solution-biased</w:t>
+            </w:r>
+            <w:proofErr w:type="gramEnd"/>
+            <w:r>
+              <w:rPr>
+                <w:sz w:val="20"/>
+                <w:szCs w:val="20"/>
+              </w:rPr>
+              <w:t>.</w:t>
             </w:r>
           </w:p>
           <w:p>
@@ -6475,7 +7222,23 @@
                 <w:sz w:val="20"/>
                 <w:szCs w:val="20"/>
               </w:rPr>
-              <w:t>Explain prioritisation and engagement strategy, not merely list names.</w:t>
+              <w:t xml:space="preserve">Explain </w:t>
+            </w:r>
+            <w:proofErr w:type="spellStart"/>
+            <w:r>
+              <w:rPr>
+                <w:sz w:val="20"/>
+                <w:szCs w:val="20"/>
+              </w:rPr>
+              <w:t>prioritisation</w:t>
+            </w:r>
+            <w:proofErr w:type="spellEnd"/>
+            <w:r>
+              <w:rPr>
+                <w:sz w:val="20"/>
+                <w:szCs w:val="20"/>
+              </w:rPr>
+              <w:t xml:space="preserve"> and engagement strategy, not merely list names.</w:t>
             </w:r>
           </w:p>
         </w:tc>
@@ -6644,8 +7407,8 @@
     </w:tbl>
     <w:p/>
     <w:sectPr>
-      <w:headerReference w:type="default" r:id="rId11"/>
-      <w:footerReference w:type="default" r:id="rId12"/>
+      <w:headerReference w:type="default" r:id="rId12"/>
+      <w:footerReference w:type="default" r:id="rId13"/>
       <w:pgSz w:w="12240" w:h="15840"/>
       <w:pgMar w:top="1080" w:right="1080" w:bottom="1080" w:left="1080" w:header="708" w:footer="708" w:gutter="0"/>
       <w:cols w:space="720"/>
@@ -7897,6 +8660,21 @@
 </file>
 
 <file path=customXml/item1.xml><?xml version="1.0" encoding="utf-8"?>
+<p:properties xmlns:p="http://schemas.microsoft.com/office/2006/metadata/properties" xmlns:xsi="http://www.w3.org/2001/XMLSchema-instance" xmlns:pc="http://schemas.microsoft.com/office/infopath/2007/PartnerControls">
+  <documentManagement/>
+</p:properties>
+</file>
+
+<file path=customXml/item2.xml><?xml version="1.0" encoding="utf-8"?>
+<?mso-contentType ?>
+<FormTemplates xmlns="http://schemas.microsoft.com/sharepoint/v3/contenttype/forms">
+  <Display>DocumentLibraryForm</Display>
+  <Edit>DocumentLibraryForm</Edit>
+  <New>DocumentLibraryForm</New>
+</FormTemplates>
+</file>
+
+<file path=customXml/item3.xml><?xml version="1.0" encoding="utf-8"?>
 <ct:contentTypeSchema xmlns:ct="http://schemas.microsoft.com/office/2006/metadata/contentType" xmlns:ma="http://schemas.microsoft.com/office/2006/metadata/properties/metaAttributes" ct:_="" ma:_="" ma:contentTypeName="Document" ma:contentTypeID="0x01010018BFDF4A301BAA4AB6AD44E29C21DF1C" ma:contentTypeVersion="3" ma:contentTypeDescription="Create a new document." ma:contentTypeScope="" ma:versionID="214581e01bcf026002f646f106b1f01a">
   <xsd:schema xmlns:xsd="http://www.w3.org/2001/XMLSchema" xmlns:xs="http://www.w3.org/2001/XMLSchema" xmlns:p="http://schemas.microsoft.com/office/2006/metadata/properties" xmlns:ns2="323798ca-42ca-4e74-a172-0bee3a6bc7a2" targetNamespace="http://schemas.microsoft.com/office/2006/metadata/properties" ma:root="true" ma:fieldsID="d197fafd2077aebd87434ff41a7985f3" ns2:_="">
     <xsd:import namespace="323798ca-42ca-4e74-a172-0bee3a6bc7a2"/>
@@ -8034,22 +8812,24 @@
 </ct:contentTypeSchema>
 </file>
 
-<file path=customXml/item2.xml><?xml version="1.0" encoding="utf-8"?>
-<?mso-contentType ?>
-<FormTemplates xmlns="http://schemas.microsoft.com/sharepoint/v3/contenttype/forms">
-  <Display>DocumentLibraryForm</Display>
-  <Edit>DocumentLibraryForm</Edit>
-  <New>DocumentLibraryForm</New>
-</FormTemplates>
+<file path=customXml/itemProps1.xml><?xml version="1.0" encoding="utf-8"?>
+<ds:datastoreItem xmlns:ds="http://schemas.openxmlformats.org/officeDocument/2006/customXml" ds:itemID="{BB3D54DC-FACC-46AE-8666-4B29367BDB66}">
+  <ds:schemaRefs>
+    <ds:schemaRef ds:uri="http://schemas.microsoft.com/office/2006/metadata/properties"/>
+    <ds:schemaRef ds:uri="http://schemas.microsoft.com/office/infopath/2007/PartnerControls"/>
+  </ds:schemaRefs>
+</ds:datastoreItem>
 </file>
 
-<file path=customXml/item3.xml><?xml version="1.0" encoding="utf-8"?>
-<p:properties xmlns:p="http://schemas.microsoft.com/office/2006/metadata/properties" xmlns:xsi="http://www.w3.org/2001/XMLSchema-instance" xmlns:pc="http://schemas.microsoft.com/office/infopath/2007/PartnerControls">
-  <documentManagement/>
-</p:properties>
+<file path=customXml/itemProps2.xml><?xml version="1.0" encoding="utf-8"?>
+<ds:datastoreItem xmlns:ds="http://schemas.openxmlformats.org/officeDocument/2006/customXml" ds:itemID="{FF277DB9-0129-42C0-A207-46EF62837127}">
+  <ds:schemaRefs>
+    <ds:schemaRef ds:uri="http://schemas.microsoft.com/sharepoint/v3/contenttype/forms"/>
+  </ds:schemaRefs>
+</ds:datastoreItem>
 </file>
 
-<file path=customXml/itemProps1.xml><?xml version="1.0" encoding="utf-8"?>
+<file path=customXml/itemProps3.xml><?xml version="1.0" encoding="utf-8"?>
 <ds:datastoreItem xmlns:ds="http://schemas.openxmlformats.org/officeDocument/2006/customXml" ds:itemID="{7DBAAC1B-242A-4652-9466-499CE0278B8B}">
   <ds:schemaRefs>
     <ds:schemaRef ds:uri="http://schemas.microsoft.com/office/2006/metadata/contentType"/>
@@ -8065,21 +8845,4 @@
     <ds:schemaRef ds:uri="http://schemas.microsoft.com/internal/obd"/>
   </ds:schemaRefs>
 </ds:datastoreItem>
-</file>
-
-<file path=customXml/itemProps2.xml><?xml version="1.0" encoding="utf-8"?>
-<ds:datastoreItem xmlns:ds="http://schemas.openxmlformats.org/officeDocument/2006/customXml" ds:itemID="{FF277DB9-0129-42C0-A207-46EF62837127}">
-  <ds:schemaRefs>
-    <ds:schemaRef ds:uri="http://schemas.microsoft.com/sharepoint/v3/contenttype/forms"/>
-  </ds:schemaRefs>
-</ds:datastoreItem>
-</file>
-
-<file path=customXml/itemProps3.xml><?xml version="1.0" encoding="utf-8"?>
-<ds:datastoreItem xmlns:ds="http://schemas.openxmlformats.org/officeDocument/2006/customXml" ds:itemID="{BB3D54DC-FACC-46AE-8666-4B29367BDB66}">
-  <ds:schemaRefs>
-    <ds:schemaRef ds:uri="http://schemas.microsoft.com/office/2006/metadata/properties"/>
-    <ds:schemaRef ds:uri="http://schemas.microsoft.com/office/infopath/2007/PartnerControls"/>
-  </ds:schemaRefs>
-</ds:datastoreItem>
 </file>
</xml_diff>